<commit_message>
docs(lab1): polish D1-4 UML and D1-5 traceability
</commit_message>
<xml_diff>
--- a/实验一_智能化需求工程与UML建模/D1-4_UML模型集/README.docx
+++ b/实验一_智能化需求工程与UML建模/D1-4_UML模型集/README.docx
@@ -4,143 +4,166 @@
   <w:body>
     <w:p>
       <w:pPr>
-        <w:spacing w:before="800" w:after="160"/>
-        <w:jc w:val="center"/>
+        <w:spacing w:after="100"/>
       </w:pPr>
       <w:r>
         <w:rPr>
           <w:rFonts w:ascii="Microsoft YaHei" w:hAnsi="Microsoft YaHei" w:eastAsia="Microsoft YaHei"/>
-          <w:b w:val="0"/>
-          <w:color w:val="777777"/>
-          <w:sz w:val="28"/>
         </w:rPr>
         <w:t>北京林业大学 · 信息学院</w:t>
       </w:r>
     </w:p>
     <w:p>
       <w:pPr>
-        <w:spacing w:after="80"/>
         <w:jc w:val="center"/>
       </w:pPr>
       <w:r>
         <w:rPr>
           <w:rFonts w:ascii="Microsoft YaHei" w:hAnsi="Microsoft YaHei" w:eastAsia="Microsoft YaHei"/>
           <w:b/>
-          <w:color w:val="1A7A3D"/>
-          <w:sz w:val="32"/>
+          <w:color w:val="177A3E"/>
+          <w:sz w:val="44"/>
         </w:rPr>
-        <w:t>《软件工程》课程</w:t>
+        <w:t>D1-4_UML模型集 README</w:t>
       </w:r>
     </w:p>
     <w:p>
       <w:pPr>
-        <w:spacing w:after="80"/>
         <w:jc w:val="center"/>
+      </w:pPr>
+      <w:r>
+        <w:t>—— 案例：NekoCafé 猫咪主题餐饮预约平台 ——</w:t>
+      </w:r>
+    </w:p>
+    <w:p>
+      <w:pPr>
+        <w:pStyle w:val="Heading1"/>
+      </w:pPr>
+      <w:r>
+        <w:rPr>
+          <w:rFonts w:ascii="Microsoft YaHei" w:hAnsi="Microsoft YaHei" w:eastAsia="Microsoft YaHei"/>
+          <w:color w:val="177A3E"/>
+        </w:rPr>
+        <w:t>1 本目录用途</w:t>
+      </w:r>
+    </w:p>
+    <w:p>
+      <w:pPr>
+        <w:spacing w:after="100"/>
+      </w:pPr>
+      <w:r>
+        <w:rPr>
+          <w:rFonts w:ascii="Microsoft YaHei" w:hAnsi="Microsoft YaHei" w:eastAsia="Microsoft YaHei"/>
+        </w:rPr>
+        <w:t>本目录用于存放实验一 D1-4 的 UML 模型源文件、导出图和文字说明。模型集以 D1-2 需求清单、D1-3 SRS 和 D1-5 追溯矩阵为依据，覆盖任务书要求的用例图、活动图、类图、顺序图和状态图。</w:t>
+      </w:r>
+    </w:p>
+    <w:p>
+      <w:pPr>
+        <w:spacing w:after="100"/>
       </w:pPr>
       <w:r>
         <w:rPr>
           <w:rFonts w:ascii="Microsoft YaHei" w:hAnsi="Microsoft YaHei" w:eastAsia="Microsoft YaHei"/>
           <w:b/>
-          <w:color w:val="1A7A3D"/>
-          <w:sz w:val="56"/>
         </w:rPr>
-        <w:t>D1-4_UML模型集  README</w:t>
+        <w:t>复核原则：</w:t>
+      </w:r>
+      <w:r>
+        <w:rPr>
+          <w:rFonts w:ascii="Microsoft YaHei" w:hAnsi="Microsoft YaHei" w:eastAsia="Microsoft YaHei"/>
+        </w:rPr>
+        <w:t>所有图中的参与者、用例、实体、状态和消息名称均采用 D1-5 Glossary 术语；每张图至少能通过 D1-5 RTM 追溯到需求 ID、用例 ID、类图实体和测试用例预占 ID。</w:t>
       </w:r>
     </w:p>
     <w:p>
       <w:pPr>
-        <w:spacing w:after="80"/>
-        <w:jc w:val="center"/>
+        <w:pStyle w:val="Heading1"/>
       </w:pPr>
       <w:r>
         <w:rPr>
           <w:rFonts w:ascii="Microsoft YaHei" w:hAnsi="Microsoft YaHei" w:eastAsia="Microsoft YaHei"/>
-          <w:b w:val="0"/>
-          <w:color w:val="777777"/>
-          <w:sz w:val="28"/>
+          <w:color w:val="177A3E"/>
         </w:rPr>
-        <w:t>Folder Package README</w:t>
+        <w:t>2 目录结构</w:t>
       </w:r>
     </w:p>
-    <w:p>
-      <w:pPr>
-        <w:spacing w:after="160"/>
-        <w:jc w:val="center"/>
-      </w:pPr>
-      <w:r>
-        <w:rPr>
-          <w:rFonts w:ascii="Microsoft YaHei" w:hAnsi="Microsoft YaHei" w:eastAsia="Microsoft YaHei"/>
-          <w:b/>
-          <w:color w:val="2E9B55"/>
-          <w:sz w:val="26"/>
-        </w:rPr>
-        <w:t>—— 案例：NekoCafé 猫咪主题餐饮预约平台 ——</w:t>
-      </w:r>
-    </w:p>
-    <w:p/>
     <w:tbl>
       <w:tblPr>
+        <w:tblStyle w:val="TableGrid"/>
         <w:tblW w:type="auto" w:w="0"/>
         <w:jc w:val="center"/>
         <w:tblLook w:firstColumn="1" w:firstRow="1" w:lastColumn="0" w:lastRow="0" w:noHBand="0" w:noVBand="1" w:val="04A0"/>
       </w:tblPr>
       <w:tblGrid>
-        <w:gridCol w:w="4873"/>
-        <w:gridCol w:w="4873"/>
+        <w:gridCol w:w="3437"/>
+        <w:gridCol w:w="3437"/>
+        <w:gridCol w:w="3437"/>
       </w:tblGrid>
       <w:tr>
         <w:tc>
           <w:tcPr>
-            <w:tcW w:type="dxa" w:w="1984"/>
-            <w:shd w:val="clear" w:color="auto" w:fill="EAF4EC"/>
-            <w:tcBorders>
-              <w:top w:val="single" w:sz="4" w:space="0" w:color="B8D8C2"/>
-              <w:left w:val="single" w:sz="4" w:space="0" w:color="B8D8C2"/>
-              <w:bottom w:val="single" w:sz="4" w:space="0" w:color="B8D8C2"/>
-              <w:right w:val="single" w:sz="4" w:space="0" w:color="B8D8C2"/>
-            </w:tcBorders>
+            <w:tcW w:type="dxa" w:w="1701"/>
+            <w:shd w:fill="EAF6EF"/>
             <w:vAlign w:val="center"/>
           </w:tcPr>
           <w:p>
             <w:pPr>
-              <w:spacing w:after="40"/>
-              <w:jc w:val="center"/>
+              <w:spacing w:after="0"/>
             </w:pPr>
+            <w:r/>
             <w:r>
               <w:rPr>
                 <w:rFonts w:ascii="Microsoft YaHei" w:hAnsi="Microsoft YaHei" w:eastAsia="Microsoft YaHei"/>
                 <w:b/>
-                <w:color w:val="1A7A3D"/>
-                <w:sz w:val="21"/>
+                <w:color w:val="173B2F"/>
+                <w:sz w:val="19"/>
               </w:rPr>
-              <w:t>包名</w:t>
+              <w:t>目录</w:t>
             </w:r>
           </w:p>
         </w:tc>
         <w:tc>
           <w:tcPr>
-            <w:tcW w:type="dxa" w:w="7087"/>
-            <w:shd w:val="clear" w:color="auto" w:fill="FFFFFF"/>
-            <w:tcBorders>
-              <w:top w:val="single" w:sz="4" w:space="0" w:color="D0D7D0"/>
-              <w:left w:val="single" w:sz="4" w:space="0" w:color="D0D7D0"/>
-              <w:bottom w:val="single" w:sz="4" w:space="0" w:color="D0D7D0"/>
-              <w:right w:val="single" w:sz="4" w:space="0" w:color="D0D7D0"/>
-            </w:tcBorders>
+            <w:tcW w:type="dxa" w:w="3402"/>
+            <w:shd w:fill="EAF6EF"/>
             <w:vAlign w:val="center"/>
           </w:tcPr>
           <w:p>
             <w:pPr>
-              <w:spacing w:after="40"/>
+              <w:spacing w:after="0"/>
             </w:pPr>
+            <w:r/>
             <w:r>
               <w:rPr>
                 <w:rFonts w:ascii="Microsoft YaHei" w:hAnsi="Microsoft YaHei" w:eastAsia="Microsoft YaHei"/>
-                <w:b w:val="0"/>
-                <w:color w:val="2B2B2B"/>
-                <w:sz w:val="21"/>
+                <w:b/>
+                <w:color w:val="173B2F"/>
+                <w:sz w:val="19"/>
               </w:rPr>
-              <w:t>D1-4_UML模型集</w:t>
+              <w:t>内容</w:t>
+            </w:r>
+          </w:p>
+        </w:tc>
+        <w:tc>
+          <w:tcPr>
+            <w:tcW w:type="dxa" w:w="3969"/>
+            <w:shd w:fill="EAF6EF"/>
+            <w:vAlign w:val="center"/>
+          </w:tcPr>
+          <w:p>
+            <w:pPr>
+              <w:spacing w:after="0"/>
+            </w:pPr>
+            <w:r/>
+            <w:r>
+              <w:rPr>
+                <w:rFonts w:ascii="Microsoft YaHei" w:hAnsi="Microsoft YaHei" w:eastAsia="Microsoft YaHei"/>
+                <w:b/>
+                <w:color w:val="173B2F"/>
+                <w:sz w:val="19"/>
+              </w:rPr>
+              <w:t>用途</w:t>
             </w:r>
           </w:p>
         </w:tc>
@@ -148,56 +171,64 @@
       <w:tr>
         <w:tc>
           <w:tcPr>
-            <w:tcW w:type="dxa" w:w="1984"/>
-            <w:shd w:val="clear" w:color="auto" w:fill="EAF4EC"/>
-            <w:tcBorders>
-              <w:top w:val="single" w:sz="4" w:space="0" w:color="B8D8C2"/>
-              <w:left w:val="single" w:sz="4" w:space="0" w:color="B8D8C2"/>
-              <w:bottom w:val="single" w:sz="4" w:space="0" w:color="B8D8C2"/>
-              <w:right w:val="single" w:sz="4" w:space="0" w:color="B8D8C2"/>
-            </w:tcBorders>
+            <w:tcW w:type="dxa" w:w="1701"/>
             <w:vAlign w:val="center"/>
           </w:tcPr>
           <w:p>
             <w:pPr>
-              <w:spacing w:after="40"/>
-              <w:jc w:val="center"/>
+              <w:spacing w:after="0"/>
             </w:pPr>
+            <w:r/>
             <w:r>
               <w:rPr>
                 <w:rFonts w:ascii="Microsoft YaHei" w:hAnsi="Microsoft YaHei" w:eastAsia="Microsoft YaHei"/>
-                <w:b/>
-                <w:color w:val="1A7A3D"/>
-                <w:sz w:val="21"/>
+                <w:b w:val="0"/>
+                <w:color w:val="111827"/>
+                <w:sz w:val="17"/>
               </w:rPr>
-              <w:t>案例项目</w:t>
+              <w:t>usecase/</w:t>
             </w:r>
           </w:p>
         </w:tc>
         <w:tc>
           <w:tcPr>
-            <w:tcW w:type="dxa" w:w="7087"/>
-            <w:shd w:val="clear" w:color="auto" w:fill="FFFFFF"/>
-            <w:tcBorders>
-              <w:top w:val="single" w:sz="4" w:space="0" w:color="D0D7D0"/>
-              <w:left w:val="single" w:sz="4" w:space="0" w:color="D0D7D0"/>
-              <w:bottom w:val="single" w:sz="4" w:space="0" w:color="D0D7D0"/>
-              <w:right w:val="single" w:sz="4" w:space="0" w:color="D0D7D0"/>
-            </w:tcBorders>
+            <w:tcW w:type="dxa" w:w="3402"/>
             <w:vAlign w:val="center"/>
           </w:tcPr>
           <w:p>
             <w:pPr>
-              <w:spacing w:after="40"/>
+              <w:spacing w:after="0"/>
             </w:pPr>
+            <w:r/>
             <w:r>
               <w:rPr>
                 <w:rFonts w:ascii="Microsoft YaHei" w:hAnsi="Microsoft YaHei" w:eastAsia="Microsoft YaHei"/>
                 <w:b w:val="0"/>
-                <w:color w:val="2B2B2B"/>
-                <w:sz w:val="21"/>
+                <w:color w:val="111827"/>
+                <w:sz w:val="17"/>
               </w:rPr>
-              <w:t>NekoCafé 猫咪主题餐饮预约平台</w:t>
+              <w:t>主用例图、会员子用例图、预约子用例图</w:t>
+            </w:r>
+          </w:p>
+        </w:tc>
+        <w:tc>
+          <w:tcPr>
+            <w:tcW w:type="dxa" w:w="3969"/>
+            <w:vAlign w:val="center"/>
+          </w:tcPr>
+          <w:p>
+            <w:pPr>
+              <w:spacing w:after="0"/>
+            </w:pPr>
+            <w:r/>
+            <w:r>
+              <w:rPr>
+                <w:rFonts w:ascii="Microsoft YaHei" w:hAnsi="Microsoft YaHei" w:eastAsia="Microsoft YaHei"/>
+                <w:b w:val="0"/>
+                <w:color w:val="111827"/>
+                <w:sz w:val="17"/>
+              </w:rPr>
+              <w:t>用例关系、include/extend、系统边界</w:t>
             </w:r>
           </w:p>
         </w:tc>
@@ -205,56 +236,64 @@
       <w:tr>
         <w:tc>
           <w:tcPr>
-            <w:tcW w:type="dxa" w:w="1984"/>
-            <w:shd w:val="clear" w:color="auto" w:fill="EAF4EC"/>
-            <w:tcBorders>
-              <w:top w:val="single" w:sz="4" w:space="0" w:color="B8D8C2"/>
-              <w:left w:val="single" w:sz="4" w:space="0" w:color="B8D8C2"/>
-              <w:bottom w:val="single" w:sz="4" w:space="0" w:color="B8D8C2"/>
-              <w:right w:val="single" w:sz="4" w:space="0" w:color="B8D8C2"/>
-            </w:tcBorders>
+            <w:tcW w:type="dxa" w:w="1701"/>
             <w:vAlign w:val="center"/>
           </w:tcPr>
           <w:p>
             <w:pPr>
-              <w:spacing w:after="40"/>
-              <w:jc w:val="center"/>
+              <w:spacing w:after="0"/>
             </w:pPr>
+            <w:r/>
             <w:r>
               <w:rPr>
                 <w:rFonts w:ascii="Microsoft YaHei" w:hAnsi="Microsoft YaHei" w:eastAsia="Microsoft YaHei"/>
-                <w:b/>
-                <w:color w:val="1A7A3D"/>
-                <w:sz w:val="21"/>
+                <w:b w:val="0"/>
+                <w:color w:val="111827"/>
+                <w:sz w:val="17"/>
               </w:rPr>
-              <w:t>模板版本</w:t>
+              <w:t>activity/</w:t>
             </w:r>
           </w:p>
         </w:tc>
         <w:tc>
           <w:tcPr>
-            <w:tcW w:type="dxa" w:w="7087"/>
-            <w:shd w:val="clear" w:color="auto" w:fill="FFFFFF"/>
-            <w:tcBorders>
-              <w:top w:val="single" w:sz="4" w:space="0" w:color="D0D7D0"/>
-              <w:left w:val="single" w:sz="4" w:space="0" w:color="D0D7D0"/>
-              <w:bottom w:val="single" w:sz="4" w:space="0" w:color="D0D7D0"/>
-              <w:right w:val="single" w:sz="4" w:space="0" w:color="D0D7D0"/>
-            </w:tcBorders>
+            <w:tcW w:type="dxa" w:w="3402"/>
             <w:vAlign w:val="center"/>
           </w:tcPr>
           <w:p>
             <w:pPr>
-              <w:spacing w:after="40"/>
+              <w:spacing w:after="0"/>
             </w:pPr>
+            <w:r/>
             <w:r>
               <w:rPr>
                 <w:rFonts w:ascii="Microsoft YaHei" w:hAnsi="Microsoft YaHei" w:eastAsia="Microsoft YaHei"/>
                 <w:b w:val="0"/>
-                <w:color w:val="2B2B2B"/>
-                <w:sz w:val="21"/>
+                <w:color w:val="111827"/>
+                <w:sz w:val="17"/>
               </w:rPr>
-              <w:t>v1.0  ·  2026-05-06</w:t>
+              <w:t>桌位预约活动图、猫咪健康打卡活动图</w:t>
+            </w:r>
+          </w:p>
+        </w:tc>
+        <w:tc>
+          <w:tcPr>
+            <w:tcW w:type="dxa" w:w="3969"/>
+            <w:vAlign w:val="center"/>
+          </w:tcPr>
+          <w:p>
+            <w:pPr>
+              <w:spacing w:after="0"/>
+            </w:pPr>
+            <w:r/>
+            <w:r>
+              <w:rPr>
+                <w:rFonts w:ascii="Microsoft YaHei" w:hAnsi="Microsoft YaHei" w:eastAsia="Microsoft YaHei"/>
+                <w:b w:val="0"/>
+                <w:color w:val="111827"/>
+                <w:sz w:val="17"/>
+              </w:rPr>
+              <w:t>主流程、异常流、角色泳道</w:t>
             </w:r>
           </w:p>
         </w:tc>
@@ -262,427 +301,1597 @@
       <w:tr>
         <w:tc>
           <w:tcPr>
-            <w:tcW w:type="dxa" w:w="1984"/>
-            <w:shd w:val="clear" w:color="auto" w:fill="EAF4EC"/>
-            <w:tcBorders>
-              <w:top w:val="single" w:sz="4" w:space="0" w:color="B8D8C2"/>
-              <w:left w:val="single" w:sz="4" w:space="0" w:color="B8D8C2"/>
-              <w:bottom w:val="single" w:sz="4" w:space="0" w:color="B8D8C2"/>
-              <w:right w:val="single" w:sz="4" w:space="0" w:color="B8D8C2"/>
-            </w:tcBorders>
+            <w:tcW w:type="dxa" w:w="1701"/>
             <w:vAlign w:val="center"/>
           </w:tcPr>
           <w:p>
             <w:pPr>
-              <w:spacing w:after="40"/>
-              <w:jc w:val="center"/>
+              <w:spacing w:after="0"/>
             </w:pPr>
+            <w:r/>
             <w:r>
               <w:rPr>
                 <w:rFonts w:ascii="Microsoft YaHei" w:hAnsi="Microsoft YaHei" w:eastAsia="Microsoft YaHei"/>
-                <w:b/>
-                <w:color w:val="1A7A3D"/>
-                <w:sz w:val="21"/>
+                <w:b w:val="0"/>
+                <w:color w:val="111827"/>
+                <w:sz w:val="17"/>
               </w:rPr>
-              <w:t>提交方式</w:t>
+              <w:t>class/</w:t>
             </w:r>
           </w:p>
         </w:tc>
         <w:tc>
           <w:tcPr>
-            <w:tcW w:type="dxa" w:w="7087"/>
-            <w:shd w:val="clear" w:color="auto" w:fill="FFFFFF"/>
-            <w:tcBorders>
-              <w:top w:val="single" w:sz="4" w:space="0" w:color="D0D7D0"/>
-              <w:left w:val="single" w:sz="4" w:space="0" w:color="D0D7D0"/>
-              <w:bottom w:val="single" w:sz="4" w:space="0" w:color="D0D7D0"/>
-              <w:right w:val="single" w:sz="4" w:space="0" w:color="D0D7D0"/>
-            </w:tcBorders>
+            <w:tcW w:type="dxa" w:w="3402"/>
             <w:vAlign w:val="center"/>
           </w:tcPr>
           <w:p>
+            <w:pPr>
+              <w:spacing w:after="0"/>
+            </w:pPr>
+            <w:r/>
             <w:r>
-              <w:t>提交整个 04_UML模型集 文件夹；源文件为 PlantUML，导出图见 exports。</w:t>
+              <w:rPr>
+                <w:rFonts w:ascii="Microsoft YaHei" w:hAnsi="Microsoft YaHei" w:eastAsia="Microsoft YaHei"/>
+                <w:b w:val="0"/>
+                <w:color w:val="111827"/>
+                <w:sz w:val="17"/>
+              </w:rPr>
+              <w:t>领域类图</w:t>
+            </w:r>
+          </w:p>
+        </w:tc>
+        <w:tc>
+          <w:tcPr>
+            <w:tcW w:type="dxa" w:w="3969"/>
+            <w:vAlign w:val="center"/>
+          </w:tcPr>
+          <w:p>
+            <w:pPr>
+              <w:spacing w:after="0"/>
+            </w:pPr>
+            <w:r/>
+            <w:r>
+              <w:rPr>
+                <w:rFonts w:ascii="Microsoft YaHei" w:hAnsi="Microsoft YaHei" w:eastAsia="Microsoft YaHei"/>
+                <w:b w:val="0"/>
+                <w:color w:val="111827"/>
+                <w:sz w:val="17"/>
+              </w:rPr>
+              <w:t>核心实体、关键属性、关联关系</w:t>
+            </w:r>
+          </w:p>
+        </w:tc>
+      </w:tr>
+      <w:tr>
+        <w:tc>
+          <w:tcPr>
+            <w:tcW w:type="dxa" w:w="1701"/>
+            <w:vAlign w:val="center"/>
+          </w:tcPr>
+          <w:p>
+            <w:pPr>
+              <w:spacing w:after="0"/>
+            </w:pPr>
+            <w:r/>
+            <w:r>
+              <w:rPr>
+                <w:rFonts w:ascii="Microsoft YaHei" w:hAnsi="Microsoft YaHei" w:eastAsia="Microsoft YaHei"/>
+                <w:b w:val="0"/>
+                <w:color w:val="111827"/>
+                <w:sz w:val="17"/>
+              </w:rPr>
+              <w:t>sequence/</w:t>
+            </w:r>
+          </w:p>
+        </w:tc>
+        <w:tc>
+          <w:tcPr>
+            <w:tcW w:type="dxa" w:w="3402"/>
+            <w:vAlign w:val="center"/>
+          </w:tcPr>
+          <w:p>
+            <w:pPr>
+              <w:spacing w:after="0"/>
+            </w:pPr>
+            <w:r/>
+            <w:r>
+              <w:rPr>
+                <w:rFonts w:ascii="Microsoft YaHei" w:hAnsi="Microsoft YaHei" w:eastAsia="Microsoft YaHei"/>
+                <w:b w:val="0"/>
+                <w:color w:val="111827"/>
+                <w:sz w:val="17"/>
+              </w:rPr>
+              <w:t>下单顺序图、跨服务调用顺序图</w:t>
+            </w:r>
+          </w:p>
+        </w:tc>
+        <w:tc>
+          <w:tcPr>
+            <w:tcW w:type="dxa" w:w="3969"/>
+            <w:vAlign w:val="center"/>
+          </w:tcPr>
+          <w:p>
+            <w:pPr>
+              <w:spacing w:after="0"/>
+            </w:pPr>
+            <w:r/>
+            <w:r>
+              <w:rPr>
+                <w:rFonts w:ascii="Microsoft YaHei" w:hAnsi="Microsoft YaHei" w:eastAsia="Microsoft YaHei"/>
+                <w:b w:val="0"/>
+                <w:color w:val="111827"/>
+                <w:sz w:val="17"/>
+              </w:rPr>
+              <w:t>同步/异步消息、回调、补偿</w:t>
+            </w:r>
+          </w:p>
+        </w:tc>
+      </w:tr>
+      <w:tr>
+        <w:tc>
+          <w:tcPr>
+            <w:tcW w:type="dxa" w:w="1701"/>
+            <w:vAlign w:val="center"/>
+          </w:tcPr>
+          <w:p>
+            <w:pPr>
+              <w:spacing w:after="0"/>
+            </w:pPr>
+            <w:r/>
+            <w:r>
+              <w:rPr>
+                <w:rFonts w:ascii="Microsoft YaHei" w:hAnsi="Microsoft YaHei" w:eastAsia="Microsoft YaHei"/>
+                <w:b w:val="0"/>
+                <w:color w:val="111827"/>
+                <w:sz w:val="17"/>
+              </w:rPr>
+              <w:t>state/</w:t>
+            </w:r>
+          </w:p>
+        </w:tc>
+        <w:tc>
+          <w:tcPr>
+            <w:tcW w:type="dxa" w:w="3402"/>
+            <w:vAlign w:val="center"/>
+          </w:tcPr>
+          <w:p>
+            <w:pPr>
+              <w:spacing w:after="0"/>
+            </w:pPr>
+            <w:r/>
+            <w:r>
+              <w:rPr>
+                <w:rFonts w:ascii="Microsoft YaHei" w:hAnsi="Microsoft YaHei" w:eastAsia="Microsoft YaHei"/>
+                <w:b w:val="0"/>
+                <w:color w:val="111827"/>
+                <w:sz w:val="17"/>
+              </w:rPr>
+              <w:t>订单/预约状态机</w:t>
+            </w:r>
+          </w:p>
+        </w:tc>
+        <w:tc>
+          <w:tcPr>
+            <w:tcW w:type="dxa" w:w="3969"/>
+            <w:vAlign w:val="center"/>
+          </w:tcPr>
+          <w:p>
+            <w:pPr>
+              <w:spacing w:after="0"/>
+            </w:pPr>
+            <w:r/>
+            <w:r>
+              <w:rPr>
+                <w:rFonts w:ascii="Microsoft YaHei" w:hAnsi="Microsoft YaHei" w:eastAsia="Microsoft YaHei"/>
+                <w:b w:val="0"/>
+                <w:color w:val="111827"/>
+                <w:sz w:val="17"/>
+              </w:rPr>
+              <w:t>支付、核销、取消、退款与异常状态</w:t>
+            </w:r>
+          </w:p>
+        </w:tc>
+      </w:tr>
+      <w:tr>
+        <w:tc>
+          <w:tcPr>
+            <w:tcW w:type="dxa" w:w="1701"/>
+            <w:vAlign w:val="center"/>
+          </w:tcPr>
+          <w:p>
+            <w:pPr>
+              <w:spacing w:after="0"/>
+            </w:pPr>
+            <w:r/>
+            <w:r>
+              <w:rPr>
+                <w:rFonts w:ascii="Microsoft YaHei" w:hAnsi="Microsoft YaHei" w:eastAsia="Microsoft YaHei"/>
+                <w:b w:val="0"/>
+                <w:color w:val="111827"/>
+                <w:sz w:val="17"/>
+              </w:rPr>
+              <w:t>exports/</w:t>
+            </w:r>
+          </w:p>
+        </w:tc>
+        <w:tc>
+          <w:tcPr>
+            <w:tcW w:type="dxa" w:w="3402"/>
+            <w:vAlign w:val="center"/>
+          </w:tcPr>
+          <w:p>
+            <w:pPr>
+              <w:spacing w:after="0"/>
+            </w:pPr>
+            <w:r/>
+            <w:r>
+              <w:rPr>
+                <w:rFonts w:ascii="Microsoft YaHei" w:hAnsi="Microsoft YaHei" w:eastAsia="Microsoft YaHei"/>
+                <w:b w:val="0"/>
+                <w:color w:val="111827"/>
+                <w:sz w:val="17"/>
+              </w:rPr>
+              <w:t>SVG、PNG、导出清单</w:t>
+            </w:r>
+          </w:p>
+        </w:tc>
+        <w:tc>
+          <w:tcPr>
+            <w:tcW w:type="dxa" w:w="3969"/>
+            <w:vAlign w:val="center"/>
+          </w:tcPr>
+          <w:p>
+            <w:pPr>
+              <w:spacing w:after="0"/>
+            </w:pPr>
+            <w:r/>
+            <w:r>
+              <w:rPr>
+                <w:rFonts w:ascii="Microsoft YaHei" w:hAnsi="Microsoft YaHei" w:eastAsia="Microsoft YaHei"/>
+                <w:b w:val="0"/>
+                <w:color w:val="111827"/>
+                <w:sz w:val="17"/>
+              </w:rPr>
+              <w:t>最终展示图与导出复核记录</w:t>
             </w:r>
           </w:p>
         </w:tc>
       </w:tr>
     </w:tbl>
-    <w:p/>
     <w:p>
+      <w:pPr>
+        <w:pStyle w:val="Heading1"/>
+      </w:pPr>
       <w:r>
-        <w:br w:type="page"/>
+        <w:rPr>
+          <w:rFonts w:ascii="Microsoft YaHei" w:hAnsi="Microsoft YaHei" w:eastAsia="Microsoft YaHei"/>
+          <w:color w:val="177A3E"/>
+        </w:rPr>
+        <w:t>3 模型清单与追溯摘要</w:t>
+      </w:r>
+    </w:p>
+    <w:tbl>
+      <w:tblPr>
+        <w:tblStyle w:val="TableGrid"/>
+        <w:tblW w:type="auto" w:w="0"/>
+        <w:jc w:val="center"/>
+        <w:tblLook w:firstColumn="1" w:firstRow="1" w:lastColumn="0" w:lastRow="0" w:noHBand="0" w:noVBand="1" w:val="04A0"/>
+      </w:tblPr>
+      <w:tblGrid>
+        <w:gridCol w:w="2062"/>
+        <w:gridCol w:w="2062"/>
+        <w:gridCol w:w="2062"/>
+        <w:gridCol w:w="2062"/>
+        <w:gridCol w:w="2062"/>
+      </w:tblGrid>
+      <w:tr>
+        <w:tc>
+          <w:tcPr>
+            <w:tcW w:type="dxa" w:w="1247"/>
+            <w:shd w:fill="EAF6EF"/>
+            <w:vAlign w:val="center"/>
+          </w:tcPr>
+          <w:p>
+            <w:pPr>
+              <w:spacing w:after="0"/>
+            </w:pPr>
+            <w:r/>
+            <w:r>
+              <w:rPr>
+                <w:rFonts w:ascii="Microsoft YaHei" w:hAnsi="Microsoft YaHei" w:eastAsia="Microsoft YaHei"/>
+                <w:b/>
+                <w:color w:val="173B2F"/>
+                <w:sz w:val="19"/>
+              </w:rPr>
+              <w:t>图编号</w:t>
+            </w:r>
+          </w:p>
+        </w:tc>
+        <w:tc>
+          <w:tcPr>
+            <w:tcW w:type="dxa" w:w="1814"/>
+            <w:shd w:fill="EAF6EF"/>
+            <w:vAlign w:val="center"/>
+          </w:tcPr>
+          <w:p>
+            <w:pPr>
+              <w:spacing w:after="0"/>
+            </w:pPr>
+            <w:r/>
+            <w:r>
+              <w:rPr>
+                <w:rFonts w:ascii="Microsoft YaHei" w:hAnsi="Microsoft YaHei" w:eastAsia="Microsoft YaHei"/>
+                <w:b/>
+                <w:color w:val="173B2F"/>
+                <w:sz w:val="19"/>
+              </w:rPr>
+              <w:t>图题</w:t>
+            </w:r>
+          </w:p>
+        </w:tc>
+        <w:tc>
+          <w:tcPr>
+            <w:tcW w:type="dxa" w:w="1134"/>
+            <w:shd w:fill="EAF6EF"/>
+            <w:vAlign w:val="center"/>
+          </w:tcPr>
+          <w:p>
+            <w:pPr>
+              <w:spacing w:after="0"/>
+            </w:pPr>
+            <w:r/>
+            <w:r>
+              <w:rPr>
+                <w:rFonts w:ascii="Microsoft YaHei" w:hAnsi="Microsoft YaHei" w:eastAsia="Microsoft YaHei"/>
+                <w:b/>
+                <w:color w:val="173B2F"/>
+                <w:sz w:val="19"/>
+              </w:rPr>
+              <w:t>类型</w:t>
+            </w:r>
+          </w:p>
+        </w:tc>
+        <w:tc>
+          <w:tcPr>
+            <w:tcW w:type="dxa" w:w="3288"/>
+            <w:shd w:fill="EAF6EF"/>
+            <w:vAlign w:val="center"/>
+          </w:tcPr>
+          <w:p>
+            <w:pPr>
+              <w:spacing w:after="0"/>
+            </w:pPr>
+            <w:r/>
+            <w:r>
+              <w:rPr>
+                <w:rFonts w:ascii="Microsoft YaHei" w:hAnsi="Microsoft YaHei" w:eastAsia="Microsoft YaHei"/>
+                <w:b/>
+                <w:color w:val="173B2F"/>
+                <w:sz w:val="19"/>
+              </w:rPr>
+              <w:t>需求覆盖</w:t>
+            </w:r>
+          </w:p>
+        </w:tc>
+        <w:tc>
+          <w:tcPr>
+            <w:tcW w:type="dxa" w:w="2608"/>
+            <w:shd w:fill="EAF6EF"/>
+            <w:vAlign w:val="center"/>
+          </w:tcPr>
+          <w:p>
+            <w:pPr>
+              <w:spacing w:after="0"/>
+            </w:pPr>
+            <w:r/>
+            <w:r>
+              <w:rPr>
+                <w:rFonts w:ascii="Microsoft YaHei" w:hAnsi="Microsoft YaHei" w:eastAsia="Microsoft YaHei"/>
+                <w:b/>
+                <w:color w:val="173B2F"/>
+                <w:sz w:val="19"/>
+              </w:rPr>
+              <w:t>源文件</w:t>
+            </w:r>
+          </w:p>
+        </w:tc>
+      </w:tr>
+      <w:tr>
+        <w:tc>
+          <w:tcPr>
+            <w:tcW w:type="dxa" w:w="1247"/>
+            <w:vAlign w:val="center"/>
+          </w:tcPr>
+          <w:p>
+            <w:pPr>
+              <w:spacing w:after="0"/>
+            </w:pPr>
+            <w:r/>
+            <w:r>
+              <w:rPr>
+                <w:rFonts w:ascii="Microsoft YaHei" w:hAnsi="Microsoft YaHei" w:eastAsia="Microsoft YaHei"/>
+                <w:b w:val="0"/>
+                <w:color w:val="111827"/>
+                <w:sz w:val="17"/>
+              </w:rPr>
+              <w:t>UC-MAIN</w:t>
+            </w:r>
+          </w:p>
+        </w:tc>
+        <w:tc>
+          <w:tcPr>
+            <w:tcW w:type="dxa" w:w="1814"/>
+            <w:vAlign w:val="center"/>
+          </w:tcPr>
+          <w:p>
+            <w:pPr>
+              <w:spacing w:after="0"/>
+            </w:pPr>
+            <w:r/>
+            <w:r>
+              <w:rPr>
+                <w:rFonts w:ascii="Microsoft YaHei" w:hAnsi="Microsoft YaHei" w:eastAsia="Microsoft YaHei"/>
+                <w:b w:val="0"/>
+                <w:color w:val="111827"/>
+                <w:sz w:val="17"/>
+              </w:rPr>
+              <w:t>主用例图</w:t>
+            </w:r>
+          </w:p>
+        </w:tc>
+        <w:tc>
+          <w:tcPr>
+            <w:tcW w:type="dxa" w:w="1134"/>
+            <w:vAlign w:val="center"/>
+          </w:tcPr>
+          <w:p>
+            <w:pPr>
+              <w:spacing w:after="0"/>
+            </w:pPr>
+            <w:r/>
+            <w:r>
+              <w:rPr>
+                <w:rFonts w:ascii="Microsoft YaHei" w:hAnsi="Microsoft YaHei" w:eastAsia="Microsoft YaHei"/>
+                <w:b w:val="0"/>
+                <w:color w:val="111827"/>
+                <w:sz w:val="17"/>
+              </w:rPr>
+              <w:t>用例图</w:t>
+            </w:r>
+          </w:p>
+        </w:tc>
+        <w:tc>
+          <w:tcPr>
+            <w:tcW w:type="dxa" w:w="3288"/>
+            <w:vAlign w:val="center"/>
+          </w:tcPr>
+          <w:p>
+            <w:pPr>
+              <w:spacing w:after="0"/>
+            </w:pPr>
+            <w:r/>
+            <w:r>
+              <w:rPr>
+                <w:rFonts w:ascii="Microsoft YaHei" w:hAnsi="Microsoft YaHei" w:eastAsia="Microsoft YaHei"/>
+                <w:b w:val="0"/>
+                <w:color w:val="111827"/>
+                <w:sz w:val="17"/>
+              </w:rPr>
+              <w:t>FR-001 至 FR-040；NFR-005、NFR-013、NFR-015</w:t>
+            </w:r>
+          </w:p>
+        </w:tc>
+        <w:tc>
+          <w:tcPr>
+            <w:tcW w:type="dxa" w:w="2608"/>
+            <w:vAlign w:val="center"/>
+          </w:tcPr>
+          <w:p>
+            <w:pPr>
+              <w:spacing w:after="0"/>
+            </w:pPr>
+            <w:r/>
+            <w:r>
+              <w:rPr>
+                <w:rFonts w:ascii="Microsoft YaHei" w:hAnsi="Microsoft YaHei" w:eastAsia="Microsoft YaHei"/>
+                <w:b w:val="0"/>
+                <w:color w:val="111827"/>
+                <w:sz w:val="17"/>
+              </w:rPr>
+              <w:t>usecase/主用例图.puml</w:t>
+            </w:r>
+          </w:p>
+        </w:tc>
+      </w:tr>
+      <w:tr>
+        <w:tc>
+          <w:tcPr>
+            <w:tcW w:type="dxa" w:w="1247"/>
+            <w:vAlign w:val="center"/>
+          </w:tcPr>
+          <w:p>
+            <w:pPr>
+              <w:spacing w:after="0"/>
+            </w:pPr>
+            <w:r/>
+            <w:r>
+              <w:rPr>
+                <w:rFonts w:ascii="Microsoft YaHei" w:hAnsi="Microsoft YaHei" w:eastAsia="Microsoft YaHei"/>
+                <w:b w:val="0"/>
+                <w:color w:val="111827"/>
+                <w:sz w:val="17"/>
+              </w:rPr>
+              <w:t>UC-MEMBER</w:t>
+            </w:r>
+          </w:p>
+        </w:tc>
+        <w:tc>
+          <w:tcPr>
+            <w:tcW w:type="dxa" w:w="1814"/>
+            <w:vAlign w:val="center"/>
+          </w:tcPr>
+          <w:p>
+            <w:pPr>
+              <w:spacing w:after="0"/>
+            </w:pPr>
+            <w:r/>
+            <w:r>
+              <w:rPr>
+                <w:rFonts w:ascii="Microsoft YaHei" w:hAnsi="Microsoft YaHei" w:eastAsia="Microsoft YaHei"/>
+                <w:b w:val="0"/>
+                <w:color w:val="111827"/>
+                <w:sz w:val="17"/>
+              </w:rPr>
+              <w:t>会员子用例图</w:t>
+            </w:r>
+          </w:p>
+        </w:tc>
+        <w:tc>
+          <w:tcPr>
+            <w:tcW w:type="dxa" w:w="1134"/>
+            <w:vAlign w:val="center"/>
+          </w:tcPr>
+          <w:p>
+            <w:pPr>
+              <w:spacing w:after="0"/>
+            </w:pPr>
+            <w:r/>
+            <w:r>
+              <w:rPr>
+                <w:rFonts w:ascii="Microsoft YaHei" w:hAnsi="Microsoft YaHei" w:eastAsia="Microsoft YaHei"/>
+                <w:b w:val="0"/>
+                <w:color w:val="111827"/>
+                <w:sz w:val="17"/>
+              </w:rPr>
+              <w:t>用例图</w:t>
+            </w:r>
+          </w:p>
+        </w:tc>
+        <w:tc>
+          <w:tcPr>
+            <w:tcW w:type="dxa" w:w="3288"/>
+            <w:vAlign w:val="center"/>
+          </w:tcPr>
+          <w:p>
+            <w:pPr>
+              <w:spacing w:after="0"/>
+            </w:pPr>
+            <w:r/>
+            <w:r>
+              <w:rPr>
+                <w:rFonts w:ascii="Microsoft YaHei" w:hAnsi="Microsoft YaHei" w:eastAsia="Microsoft YaHei"/>
+                <w:b w:val="0"/>
+                <w:color w:val="111827"/>
+                <w:sz w:val="17"/>
+              </w:rPr>
+              <w:t>FR-003 至 FR-005、FR-013 至 FR-015、FR-028、FR-034、NFR-011、NFR-015</w:t>
+            </w:r>
+          </w:p>
+        </w:tc>
+        <w:tc>
+          <w:tcPr>
+            <w:tcW w:type="dxa" w:w="2608"/>
+            <w:vAlign w:val="center"/>
+          </w:tcPr>
+          <w:p>
+            <w:pPr>
+              <w:spacing w:after="0"/>
+            </w:pPr>
+            <w:r/>
+            <w:r>
+              <w:rPr>
+                <w:rFonts w:ascii="Microsoft YaHei" w:hAnsi="Microsoft YaHei" w:eastAsia="Microsoft YaHei"/>
+                <w:b w:val="0"/>
+                <w:color w:val="111827"/>
+                <w:sz w:val="17"/>
+              </w:rPr>
+              <w:t>usecase/子用例_会员.puml</w:t>
+            </w:r>
+          </w:p>
+        </w:tc>
+      </w:tr>
+      <w:tr>
+        <w:tc>
+          <w:tcPr>
+            <w:tcW w:type="dxa" w:w="1247"/>
+            <w:vAlign w:val="center"/>
+          </w:tcPr>
+          <w:p>
+            <w:pPr>
+              <w:spacing w:after="0"/>
+            </w:pPr>
+            <w:r/>
+            <w:r>
+              <w:rPr>
+                <w:rFonts w:ascii="Microsoft YaHei" w:hAnsi="Microsoft YaHei" w:eastAsia="Microsoft YaHei"/>
+                <w:b w:val="0"/>
+                <w:color w:val="111827"/>
+                <w:sz w:val="17"/>
+              </w:rPr>
+              <w:t>UC-RESERVE</w:t>
+            </w:r>
+          </w:p>
+        </w:tc>
+        <w:tc>
+          <w:tcPr>
+            <w:tcW w:type="dxa" w:w="1814"/>
+            <w:vAlign w:val="center"/>
+          </w:tcPr>
+          <w:p>
+            <w:pPr>
+              <w:spacing w:after="0"/>
+            </w:pPr>
+            <w:r/>
+            <w:r>
+              <w:rPr>
+                <w:rFonts w:ascii="Microsoft YaHei" w:hAnsi="Microsoft YaHei" w:eastAsia="Microsoft YaHei"/>
+                <w:b w:val="0"/>
+                <w:color w:val="111827"/>
+                <w:sz w:val="17"/>
+              </w:rPr>
+              <w:t>预约子用例图</w:t>
+            </w:r>
+          </w:p>
+        </w:tc>
+        <w:tc>
+          <w:tcPr>
+            <w:tcW w:type="dxa" w:w="1134"/>
+            <w:vAlign w:val="center"/>
+          </w:tcPr>
+          <w:p>
+            <w:pPr>
+              <w:spacing w:after="0"/>
+            </w:pPr>
+            <w:r/>
+            <w:r>
+              <w:rPr>
+                <w:rFonts w:ascii="Microsoft YaHei" w:hAnsi="Microsoft YaHei" w:eastAsia="Microsoft YaHei"/>
+                <w:b w:val="0"/>
+                <w:color w:val="111827"/>
+                <w:sz w:val="17"/>
+              </w:rPr>
+              <w:t>用例图</w:t>
+            </w:r>
+          </w:p>
+        </w:tc>
+        <w:tc>
+          <w:tcPr>
+            <w:tcW w:type="dxa" w:w="3288"/>
+            <w:vAlign w:val="center"/>
+          </w:tcPr>
+          <w:p>
+            <w:pPr>
+              <w:spacing w:after="0"/>
+            </w:pPr>
+            <w:r/>
+            <w:r>
+              <w:rPr>
+                <w:rFonts w:ascii="Microsoft YaHei" w:hAnsi="Microsoft YaHei" w:eastAsia="Microsoft YaHei"/>
+                <w:b w:val="0"/>
+                <w:color w:val="111827"/>
+                <w:sz w:val="17"/>
+              </w:rPr>
+              <w:t>FR-001、FR-002、FR-006 至 FR-009、FR-014、FR-036、FR-039、NFR-002、NFR-006</w:t>
+            </w:r>
+          </w:p>
+        </w:tc>
+        <w:tc>
+          <w:tcPr>
+            <w:tcW w:type="dxa" w:w="2608"/>
+            <w:vAlign w:val="center"/>
+          </w:tcPr>
+          <w:p>
+            <w:pPr>
+              <w:spacing w:after="0"/>
+            </w:pPr>
+            <w:r/>
+            <w:r>
+              <w:rPr>
+                <w:rFonts w:ascii="Microsoft YaHei" w:hAnsi="Microsoft YaHei" w:eastAsia="Microsoft YaHei"/>
+                <w:b w:val="0"/>
+                <w:color w:val="111827"/>
+                <w:sz w:val="17"/>
+              </w:rPr>
+              <w:t>usecase/子用例_预约.puml</w:t>
+            </w:r>
+          </w:p>
+        </w:tc>
+      </w:tr>
+      <w:tr>
+        <w:tc>
+          <w:tcPr>
+            <w:tcW w:type="dxa" w:w="1247"/>
+            <w:vAlign w:val="center"/>
+          </w:tcPr>
+          <w:p>
+            <w:pPr>
+              <w:spacing w:after="0"/>
+            </w:pPr>
+            <w:r/>
+            <w:r>
+              <w:rPr>
+                <w:rFonts w:ascii="Microsoft YaHei" w:hAnsi="Microsoft YaHei" w:eastAsia="Microsoft YaHei"/>
+                <w:b w:val="0"/>
+                <w:color w:val="111827"/>
+                <w:sz w:val="17"/>
+              </w:rPr>
+              <w:t>ACT-RESERVE</w:t>
+            </w:r>
+          </w:p>
+        </w:tc>
+        <w:tc>
+          <w:tcPr>
+            <w:tcW w:type="dxa" w:w="1814"/>
+            <w:vAlign w:val="center"/>
+          </w:tcPr>
+          <w:p>
+            <w:pPr>
+              <w:spacing w:after="0"/>
+            </w:pPr>
+            <w:r/>
+            <w:r>
+              <w:rPr>
+                <w:rFonts w:ascii="Microsoft YaHei" w:hAnsi="Microsoft YaHei" w:eastAsia="Microsoft YaHei"/>
+                <w:b w:val="0"/>
+                <w:color w:val="111827"/>
+                <w:sz w:val="17"/>
+              </w:rPr>
+              <w:t>桌位预约活动图</w:t>
+            </w:r>
+          </w:p>
+        </w:tc>
+        <w:tc>
+          <w:tcPr>
+            <w:tcW w:type="dxa" w:w="1134"/>
+            <w:vAlign w:val="center"/>
+          </w:tcPr>
+          <w:p>
+            <w:pPr>
+              <w:spacing w:after="0"/>
+            </w:pPr>
+            <w:r/>
+            <w:r>
+              <w:rPr>
+                <w:rFonts w:ascii="Microsoft YaHei" w:hAnsi="Microsoft YaHei" w:eastAsia="Microsoft YaHei"/>
+                <w:b w:val="0"/>
+                <w:color w:val="111827"/>
+                <w:sz w:val="17"/>
+              </w:rPr>
+              <w:t>活动图</w:t>
+            </w:r>
+          </w:p>
+        </w:tc>
+        <w:tc>
+          <w:tcPr>
+            <w:tcW w:type="dxa" w:w="3288"/>
+            <w:vAlign w:val="center"/>
+          </w:tcPr>
+          <w:p>
+            <w:pPr>
+              <w:spacing w:after="0"/>
+            </w:pPr>
+            <w:r/>
+            <w:r>
+              <w:rPr>
+                <w:rFonts w:ascii="Microsoft YaHei" w:hAnsi="Microsoft YaHei" w:eastAsia="Microsoft YaHei"/>
+                <w:b w:val="0"/>
+                <w:color w:val="111827"/>
+                <w:sz w:val="17"/>
+              </w:rPr>
+              <w:t>FR-006 至 FR-009、FR-014、FR-036、FR-039、NFR-002、NFR-006</w:t>
+            </w:r>
+          </w:p>
+        </w:tc>
+        <w:tc>
+          <w:tcPr>
+            <w:tcW w:type="dxa" w:w="2608"/>
+            <w:vAlign w:val="center"/>
+          </w:tcPr>
+          <w:p>
+            <w:pPr>
+              <w:spacing w:after="0"/>
+            </w:pPr>
+            <w:r/>
+            <w:r>
+              <w:rPr>
+                <w:rFonts w:ascii="Microsoft YaHei" w:hAnsi="Microsoft YaHei" w:eastAsia="Microsoft YaHei"/>
+                <w:b w:val="0"/>
+                <w:color w:val="111827"/>
+                <w:sz w:val="17"/>
+              </w:rPr>
+              <w:t>activity/桌位预约活动图.puml</w:t>
+            </w:r>
+          </w:p>
+        </w:tc>
+      </w:tr>
+      <w:tr>
+        <w:tc>
+          <w:tcPr>
+            <w:tcW w:type="dxa" w:w="1247"/>
+            <w:vAlign w:val="center"/>
+          </w:tcPr>
+          <w:p>
+            <w:pPr>
+              <w:spacing w:after="0"/>
+            </w:pPr>
+            <w:r/>
+            <w:r>
+              <w:rPr>
+                <w:rFonts w:ascii="Microsoft YaHei" w:hAnsi="Microsoft YaHei" w:eastAsia="Microsoft YaHei"/>
+                <w:b w:val="0"/>
+                <w:color w:val="111827"/>
+                <w:sz w:val="17"/>
+              </w:rPr>
+              <w:t>ACT-HEALTH</w:t>
+            </w:r>
+          </w:p>
+        </w:tc>
+        <w:tc>
+          <w:tcPr>
+            <w:tcW w:type="dxa" w:w="1814"/>
+            <w:vAlign w:val="center"/>
+          </w:tcPr>
+          <w:p>
+            <w:pPr>
+              <w:spacing w:after="0"/>
+            </w:pPr>
+            <w:r/>
+            <w:r>
+              <w:rPr>
+                <w:rFonts w:ascii="Microsoft YaHei" w:hAnsi="Microsoft YaHei" w:eastAsia="Microsoft YaHei"/>
+                <w:b w:val="0"/>
+                <w:color w:val="111827"/>
+                <w:sz w:val="17"/>
+              </w:rPr>
+              <w:t>猫咪健康打卡活动图</w:t>
+            </w:r>
+          </w:p>
+        </w:tc>
+        <w:tc>
+          <w:tcPr>
+            <w:tcW w:type="dxa" w:w="1134"/>
+            <w:vAlign w:val="center"/>
+          </w:tcPr>
+          <w:p>
+            <w:pPr>
+              <w:spacing w:after="0"/>
+            </w:pPr>
+            <w:r/>
+            <w:r>
+              <w:rPr>
+                <w:rFonts w:ascii="Microsoft YaHei" w:hAnsi="Microsoft YaHei" w:eastAsia="Microsoft YaHei"/>
+                <w:b w:val="0"/>
+                <w:color w:val="111827"/>
+                <w:sz w:val="17"/>
+              </w:rPr>
+              <w:t>活动图</w:t>
+            </w:r>
+          </w:p>
+        </w:tc>
+        <w:tc>
+          <w:tcPr>
+            <w:tcW w:type="dxa" w:w="3288"/>
+            <w:vAlign w:val="center"/>
+          </w:tcPr>
+          <w:p>
+            <w:pPr>
+              <w:spacing w:after="0"/>
+            </w:pPr>
+            <w:r/>
+            <w:r>
+              <w:rPr>
+                <w:rFonts w:ascii="Microsoft YaHei" w:hAnsi="Microsoft YaHei" w:eastAsia="Microsoft YaHei"/>
+                <w:b w:val="0"/>
+                <w:color w:val="111827"/>
+                <w:sz w:val="17"/>
+              </w:rPr>
+              <w:t>FR-020 至 FR-022、FR-035、FR-036、NFR-012、NFR-016</w:t>
+            </w:r>
+          </w:p>
+        </w:tc>
+        <w:tc>
+          <w:tcPr>
+            <w:tcW w:type="dxa" w:w="2608"/>
+            <w:vAlign w:val="center"/>
+          </w:tcPr>
+          <w:p>
+            <w:pPr>
+              <w:spacing w:after="0"/>
+            </w:pPr>
+            <w:r/>
+            <w:r>
+              <w:rPr>
+                <w:rFonts w:ascii="Microsoft YaHei" w:hAnsi="Microsoft YaHei" w:eastAsia="Microsoft YaHei"/>
+                <w:b w:val="0"/>
+                <w:color w:val="111827"/>
+                <w:sz w:val="17"/>
+              </w:rPr>
+              <w:t>activity/猫咪健康打卡活动图.puml</w:t>
+            </w:r>
+          </w:p>
+        </w:tc>
+      </w:tr>
+      <w:tr>
+        <w:tc>
+          <w:tcPr>
+            <w:tcW w:type="dxa" w:w="1247"/>
+            <w:vAlign w:val="center"/>
+          </w:tcPr>
+          <w:p>
+            <w:pPr>
+              <w:spacing w:after="0"/>
+            </w:pPr>
+            <w:r/>
+            <w:r>
+              <w:rPr>
+                <w:rFonts w:ascii="Microsoft YaHei" w:hAnsi="Microsoft YaHei" w:eastAsia="Microsoft YaHei"/>
+                <w:b w:val="0"/>
+                <w:color w:val="111827"/>
+                <w:sz w:val="17"/>
+              </w:rPr>
+              <w:t>CLS-DOMAIN</w:t>
+            </w:r>
+          </w:p>
+        </w:tc>
+        <w:tc>
+          <w:tcPr>
+            <w:tcW w:type="dxa" w:w="1814"/>
+            <w:vAlign w:val="center"/>
+          </w:tcPr>
+          <w:p>
+            <w:pPr>
+              <w:spacing w:after="0"/>
+            </w:pPr>
+            <w:r/>
+            <w:r>
+              <w:rPr>
+                <w:rFonts w:ascii="Microsoft YaHei" w:hAnsi="Microsoft YaHei" w:eastAsia="Microsoft YaHei"/>
+                <w:b w:val="0"/>
+                <w:color w:val="111827"/>
+                <w:sz w:val="17"/>
+              </w:rPr>
+              <w:t>领域类图</w:t>
+            </w:r>
+          </w:p>
+        </w:tc>
+        <w:tc>
+          <w:tcPr>
+            <w:tcW w:type="dxa" w:w="1134"/>
+            <w:vAlign w:val="center"/>
+          </w:tcPr>
+          <w:p>
+            <w:pPr>
+              <w:spacing w:after="0"/>
+            </w:pPr>
+            <w:r/>
+            <w:r>
+              <w:rPr>
+                <w:rFonts w:ascii="Microsoft YaHei" w:hAnsi="Microsoft YaHei" w:eastAsia="Microsoft YaHei"/>
+                <w:b w:val="0"/>
+                <w:color w:val="111827"/>
+                <w:sz w:val="17"/>
+              </w:rPr>
+              <w:t>类图</w:t>
+            </w:r>
+          </w:p>
+        </w:tc>
+        <w:tc>
+          <w:tcPr>
+            <w:tcW w:type="dxa" w:w="3288"/>
+            <w:vAlign w:val="center"/>
+          </w:tcPr>
+          <w:p>
+            <w:pPr>
+              <w:spacing w:after="0"/>
+            </w:pPr>
+            <w:r/>
+            <w:r>
+              <w:rPr>
+                <w:rFonts w:ascii="Microsoft YaHei" w:hAnsi="Microsoft YaHei" w:eastAsia="Microsoft YaHei"/>
+                <w:b w:val="0"/>
+                <w:color w:val="111827"/>
+                <w:sz w:val="17"/>
+              </w:rPr>
+              <w:t>FR-001 至 FR-040；NFR-005、NFR-006、NFR-013、NFR-015</w:t>
+            </w:r>
+          </w:p>
+        </w:tc>
+        <w:tc>
+          <w:tcPr>
+            <w:tcW w:type="dxa" w:w="2608"/>
+            <w:vAlign w:val="center"/>
+          </w:tcPr>
+          <w:p>
+            <w:pPr>
+              <w:spacing w:after="0"/>
+            </w:pPr>
+            <w:r/>
+            <w:r>
+              <w:rPr>
+                <w:rFonts w:ascii="Microsoft YaHei" w:hAnsi="Microsoft YaHei" w:eastAsia="Microsoft YaHei"/>
+                <w:b w:val="0"/>
+                <w:color w:val="111827"/>
+                <w:sz w:val="17"/>
+              </w:rPr>
+              <w:t>class/领域类图.puml</w:t>
+            </w:r>
+          </w:p>
+        </w:tc>
+      </w:tr>
+      <w:tr>
+        <w:tc>
+          <w:tcPr>
+            <w:tcW w:type="dxa" w:w="1247"/>
+            <w:vAlign w:val="center"/>
+          </w:tcPr>
+          <w:p>
+            <w:pPr>
+              <w:spacing w:after="0"/>
+            </w:pPr>
+            <w:r/>
+            <w:r>
+              <w:rPr>
+                <w:rFonts w:ascii="Microsoft YaHei" w:hAnsi="Microsoft YaHei" w:eastAsia="Microsoft YaHei"/>
+                <w:b w:val="0"/>
+                <w:color w:val="111827"/>
+                <w:sz w:val="17"/>
+              </w:rPr>
+              <w:t>SEQ-ORDER</w:t>
+            </w:r>
+          </w:p>
+        </w:tc>
+        <w:tc>
+          <w:tcPr>
+            <w:tcW w:type="dxa" w:w="1814"/>
+            <w:vAlign w:val="center"/>
+          </w:tcPr>
+          <w:p>
+            <w:pPr>
+              <w:spacing w:after="0"/>
+            </w:pPr>
+            <w:r/>
+            <w:r>
+              <w:rPr>
+                <w:rFonts w:ascii="Microsoft YaHei" w:hAnsi="Microsoft YaHei" w:eastAsia="Microsoft YaHei"/>
+                <w:b w:val="0"/>
+                <w:color w:val="111827"/>
+                <w:sz w:val="17"/>
+              </w:rPr>
+              <w:t>下单顺序图</w:t>
+            </w:r>
+          </w:p>
+        </w:tc>
+        <w:tc>
+          <w:tcPr>
+            <w:tcW w:type="dxa" w:w="1134"/>
+            <w:vAlign w:val="center"/>
+          </w:tcPr>
+          <w:p>
+            <w:pPr>
+              <w:spacing w:after="0"/>
+            </w:pPr>
+            <w:r/>
+            <w:r>
+              <w:rPr>
+                <w:rFonts w:ascii="Microsoft YaHei" w:hAnsi="Microsoft YaHei" w:eastAsia="Microsoft YaHei"/>
+                <w:b w:val="0"/>
+                <w:color w:val="111827"/>
+                <w:sz w:val="17"/>
+              </w:rPr>
+              <w:t>顺序图</w:t>
+            </w:r>
+          </w:p>
+        </w:tc>
+        <w:tc>
+          <w:tcPr>
+            <w:tcW w:type="dxa" w:w="3288"/>
+            <w:vAlign w:val="center"/>
+          </w:tcPr>
+          <w:p>
+            <w:pPr>
+              <w:spacing w:after="0"/>
+            </w:pPr>
+            <w:r/>
+            <w:r>
+              <w:rPr>
+                <w:rFonts w:ascii="Microsoft YaHei" w:hAnsi="Microsoft YaHei" w:eastAsia="Microsoft YaHei"/>
+                <w:b w:val="0"/>
+                <w:color w:val="111827"/>
+                <w:sz w:val="17"/>
+              </w:rPr>
+              <w:t>FR-010 至 FR-012、FR-018、FR-025、NFR-003、NFR-006</w:t>
+            </w:r>
+          </w:p>
+        </w:tc>
+        <w:tc>
+          <w:tcPr>
+            <w:tcW w:type="dxa" w:w="2608"/>
+            <w:vAlign w:val="center"/>
+          </w:tcPr>
+          <w:p>
+            <w:pPr>
+              <w:spacing w:after="0"/>
+            </w:pPr>
+            <w:r/>
+            <w:r>
+              <w:rPr>
+                <w:rFonts w:ascii="Microsoft YaHei" w:hAnsi="Microsoft YaHei" w:eastAsia="Microsoft YaHei"/>
+                <w:b w:val="0"/>
+                <w:color w:val="111827"/>
+                <w:sz w:val="17"/>
+              </w:rPr>
+              <w:t>sequence/下单顺序图.puml</w:t>
+            </w:r>
+          </w:p>
+        </w:tc>
+      </w:tr>
+      <w:tr>
+        <w:tc>
+          <w:tcPr>
+            <w:tcW w:type="dxa" w:w="1247"/>
+            <w:vAlign w:val="center"/>
+          </w:tcPr>
+          <w:p>
+            <w:pPr>
+              <w:spacing w:after="0"/>
+            </w:pPr>
+            <w:r/>
+            <w:r>
+              <w:rPr>
+                <w:rFonts w:ascii="Microsoft YaHei" w:hAnsi="Microsoft YaHei" w:eastAsia="Microsoft YaHei"/>
+                <w:b w:val="0"/>
+                <w:color w:val="111827"/>
+                <w:sz w:val="17"/>
+              </w:rPr>
+              <w:t>SEQ-CROSS</w:t>
+            </w:r>
+          </w:p>
+        </w:tc>
+        <w:tc>
+          <w:tcPr>
+            <w:tcW w:type="dxa" w:w="1814"/>
+            <w:vAlign w:val="center"/>
+          </w:tcPr>
+          <w:p>
+            <w:pPr>
+              <w:spacing w:after="0"/>
+            </w:pPr>
+            <w:r/>
+            <w:r>
+              <w:rPr>
+                <w:rFonts w:ascii="Microsoft YaHei" w:hAnsi="Microsoft YaHei" w:eastAsia="Microsoft YaHei"/>
+                <w:b w:val="0"/>
+                <w:color w:val="111827"/>
+                <w:sz w:val="17"/>
+              </w:rPr>
+              <w:t>跨服务调用顺序图</w:t>
+            </w:r>
+          </w:p>
+        </w:tc>
+        <w:tc>
+          <w:tcPr>
+            <w:tcW w:type="dxa" w:w="1134"/>
+            <w:vAlign w:val="center"/>
+          </w:tcPr>
+          <w:p>
+            <w:pPr>
+              <w:spacing w:after="0"/>
+            </w:pPr>
+            <w:r/>
+            <w:r>
+              <w:rPr>
+                <w:rFonts w:ascii="Microsoft YaHei" w:hAnsi="Microsoft YaHei" w:eastAsia="Microsoft YaHei"/>
+                <w:b w:val="0"/>
+                <w:color w:val="111827"/>
+                <w:sz w:val="17"/>
+              </w:rPr>
+              <w:t>顺序图</w:t>
+            </w:r>
+          </w:p>
+        </w:tc>
+        <w:tc>
+          <w:tcPr>
+            <w:tcW w:type="dxa" w:w="3288"/>
+            <w:vAlign w:val="center"/>
+          </w:tcPr>
+          <w:p>
+            <w:pPr>
+              <w:spacing w:after="0"/>
+            </w:pPr>
+            <w:r/>
+            <w:r>
+              <w:rPr>
+                <w:rFonts w:ascii="Microsoft YaHei" w:hAnsi="Microsoft YaHei" w:eastAsia="Microsoft YaHei"/>
+                <w:b w:val="0"/>
+                <w:color w:val="111827"/>
+                <w:sz w:val="17"/>
+              </w:rPr>
+              <w:t>FR-006 至 FR-009、FR-014、FR-038、FR-039、NFR-006、NFR-013</w:t>
+            </w:r>
+          </w:p>
+        </w:tc>
+        <w:tc>
+          <w:tcPr>
+            <w:tcW w:type="dxa" w:w="2608"/>
+            <w:vAlign w:val="center"/>
+          </w:tcPr>
+          <w:p>
+            <w:pPr>
+              <w:spacing w:after="0"/>
+            </w:pPr>
+            <w:r/>
+            <w:r>
+              <w:rPr>
+                <w:rFonts w:ascii="Microsoft YaHei" w:hAnsi="Microsoft YaHei" w:eastAsia="Microsoft YaHei"/>
+                <w:b w:val="0"/>
+                <w:color w:val="111827"/>
+                <w:sz w:val="17"/>
+              </w:rPr>
+              <w:t>sequence/跨服务调用顺序图.puml</w:t>
+            </w:r>
+          </w:p>
+        </w:tc>
+      </w:tr>
+      <w:tr>
+        <w:tc>
+          <w:tcPr>
+            <w:tcW w:type="dxa" w:w="1247"/>
+            <w:vAlign w:val="center"/>
+          </w:tcPr>
+          <w:p>
+            <w:pPr>
+              <w:spacing w:after="0"/>
+            </w:pPr>
+            <w:r/>
+            <w:r>
+              <w:rPr>
+                <w:rFonts w:ascii="Microsoft YaHei" w:hAnsi="Microsoft YaHei" w:eastAsia="Microsoft YaHei"/>
+                <w:b w:val="0"/>
+                <w:color w:val="111827"/>
+                <w:sz w:val="17"/>
+              </w:rPr>
+              <w:t>STA-ORDER</w:t>
+            </w:r>
+          </w:p>
+        </w:tc>
+        <w:tc>
+          <w:tcPr>
+            <w:tcW w:type="dxa" w:w="1814"/>
+            <w:vAlign w:val="center"/>
+          </w:tcPr>
+          <w:p>
+            <w:pPr>
+              <w:spacing w:after="0"/>
+            </w:pPr>
+            <w:r/>
+            <w:r>
+              <w:rPr>
+                <w:rFonts w:ascii="Microsoft YaHei" w:hAnsi="Microsoft YaHei" w:eastAsia="Microsoft YaHei"/>
+                <w:b w:val="0"/>
+                <w:color w:val="111827"/>
+                <w:sz w:val="17"/>
+              </w:rPr>
+              <w:t>订单/预约状态机</w:t>
+            </w:r>
+          </w:p>
+        </w:tc>
+        <w:tc>
+          <w:tcPr>
+            <w:tcW w:type="dxa" w:w="1134"/>
+            <w:vAlign w:val="center"/>
+          </w:tcPr>
+          <w:p>
+            <w:pPr>
+              <w:spacing w:after="0"/>
+            </w:pPr>
+            <w:r/>
+            <w:r>
+              <w:rPr>
+                <w:rFonts w:ascii="Microsoft YaHei" w:hAnsi="Microsoft YaHei" w:eastAsia="Microsoft YaHei"/>
+                <w:b w:val="0"/>
+                <w:color w:val="111827"/>
+                <w:sz w:val="17"/>
+              </w:rPr>
+              <w:t>状态图</w:t>
+            </w:r>
+          </w:p>
+        </w:tc>
+        <w:tc>
+          <w:tcPr>
+            <w:tcW w:type="dxa" w:w="3288"/>
+            <w:vAlign w:val="center"/>
+          </w:tcPr>
+          <w:p>
+            <w:pPr>
+              <w:spacing w:after="0"/>
+            </w:pPr>
+            <w:r/>
+            <w:r>
+              <w:rPr>
+                <w:rFonts w:ascii="Microsoft YaHei" w:hAnsi="Microsoft YaHei" w:eastAsia="Microsoft YaHei"/>
+                <w:b w:val="0"/>
+                <w:color w:val="111827"/>
+                <w:sz w:val="17"/>
+              </w:rPr>
+              <w:t>FR-006、FR-007、FR-012、FR-014、FR-018、FR-039、NFR-006</w:t>
+            </w:r>
+          </w:p>
+        </w:tc>
+        <w:tc>
+          <w:tcPr>
+            <w:tcW w:type="dxa" w:w="2608"/>
+            <w:vAlign w:val="center"/>
+          </w:tcPr>
+          <w:p>
+            <w:pPr>
+              <w:spacing w:after="0"/>
+            </w:pPr>
+            <w:r/>
+            <w:r>
+              <w:rPr>
+                <w:rFonts w:ascii="Microsoft YaHei" w:hAnsi="Microsoft YaHei" w:eastAsia="Microsoft YaHei"/>
+                <w:b w:val="0"/>
+                <w:color w:val="111827"/>
+                <w:sz w:val="17"/>
+              </w:rPr>
+              <w:t>state/订单状态机.puml</w:t>
+            </w:r>
+          </w:p>
+        </w:tc>
+      </w:tr>
+    </w:tbl>
+    <w:p>
+      <w:pPr>
+        <w:pStyle w:val="Heading1"/>
+      </w:pPr>
+      <w:r>
+        <w:rPr>
+          <w:rFonts w:ascii="Microsoft YaHei" w:hAnsi="Microsoft YaHei" w:eastAsia="Microsoft YaHei"/>
+          <w:color w:val="177A3E"/>
+        </w:rPr>
+        <w:t>4 导出与提交说明</w:t>
       </w:r>
     </w:p>
     <w:p>
       <w:pPr>
-        <w:keepNext/>
-        <w:spacing w:before="280" w:after="120"/>
-        <w:pBdr>
-          <w:bottom w:val="single" w:sz="8" w:space="4" w:color="1A7A3D"/>
-        </w:pBdr>
+        <w:spacing w:after="100"/>
+      </w:pPr>
+      <w:r>
+        <w:rPr>
+          <w:rFonts w:ascii="Microsoft YaHei" w:hAnsi="Microsoft YaHei" w:eastAsia="Microsoft YaHei"/>
+        </w:rPr>
+        <w:t>每张图均保留 `.puml` 源文件、同名 `.md` 说明文件、`exports/*.svg` 矢量图和 `exports/*.png` 位图。</w:t>
+      </w:r>
+    </w:p>
+    <w:p>
+      <w:pPr>
+        <w:spacing w:after="100"/>
+      </w:pPr>
+      <w:r>
+        <w:rPr>
+          <w:rFonts w:ascii="Microsoft YaHei" w:hAnsi="Microsoft YaHei" w:eastAsia="Microsoft YaHei"/>
+        </w:rPr>
+        <w:t>PNG 用于 Word/PPT 展示，SVG 用于矢量复核；若修改 PUML，应重新导出 SVG/PNG 并更新 `exports/导出清单.md`。</w:t>
+      </w:r>
+    </w:p>
+    <w:p>
+      <w:pPr>
+        <w:spacing w:after="100"/>
+      </w:pPr>
+      <w:r>
+        <w:rPr>
+          <w:rFonts w:ascii="Microsoft YaHei" w:hAnsi="Microsoft YaHei" w:eastAsia="Microsoft YaHei"/>
+        </w:rPr>
+        <w:t>D1-5 RTM 已按 UC-01 至 UC-12、QC-01 至 QC-08 对模型进行追溯，后续需求变更时需同步更新 RTM。</w:t>
+      </w:r>
+    </w:p>
+    <w:p>
+      <w:pPr>
+        <w:pStyle w:val="Heading1"/>
+      </w:pPr>
+      <w:r>
+        <w:rPr>
+          <w:rFonts w:ascii="Microsoft YaHei" w:hAnsi="Microsoft YaHei" w:eastAsia="Microsoft YaHei"/>
+          <w:color w:val="177A3E"/>
+        </w:rPr>
+        <w:t>5 关键图预览</w:t>
+      </w:r>
+    </w:p>
+    <w:p>
+      <w:pPr>
+        <w:spacing w:after="100"/>
       </w:pPr>
       <w:r>
         <w:rPr>
           <w:rFonts w:ascii="Microsoft YaHei" w:hAnsi="Microsoft YaHei" w:eastAsia="Microsoft YaHei"/>
           <w:b/>
-          <w:color w:val="1A7A3D"/>
-          <w:sz w:val="36"/>
         </w:rPr>
-        <w:t>本目录用途</w:t>
+        <w:t>UC-MAIN 主用例图：</w:t>
+      </w:r>
+      <w:r>
+        <w:rPr>
+          <w:rFonts w:ascii="Microsoft YaHei" w:hAnsi="Microsoft YaHei" w:eastAsia="Microsoft YaHei"/>
+        </w:rPr>
+        <w:t>给出 NekoCafé 预约平台的系统边界、外部参与者和 12 个核心用例，作为 D1-3 SRS 与 D1-5 RTM 的总索引。</w:t>
       </w:r>
     </w:p>
     <w:p>
       <w:pPr>
-        <w:spacing w:after="80" w:before="0" w:line="336" w:lineRule="auto"/>
-        <w:ind w:firstLine="340"/>
-        <w:jc w:val="left"/>
+        <w:jc w:val="center"/>
       </w:pPr>
       <w:r>
-        <w:rPr>
-          <w:rFonts w:ascii="Microsoft YaHei" w:hAnsi="Microsoft YaHei" w:eastAsia="Microsoft YaHei"/>
-          <w:b w:val="0"/>
-          <w:color w:val="2B2B2B"/>
-          <w:sz w:val="21"/>
-        </w:rPr>
-        <w:t>本目录用于存放 UML 模型源文件（.puml）与导出图（PNG / SVG）。建议使用 PlantUML 或 StarUML，并在 IDE 中安装 PlantUML 插件实时预览。</w:t>
+        <w:drawing>
+          <wp:inline xmlns:a="http://schemas.openxmlformats.org/drawingml/2006/main" xmlns:pic="http://schemas.openxmlformats.org/drawingml/2006/picture">
+            <wp:extent cx="5669280" cy="3501614"/>
+            <wp:docPr id="1" name="Picture 1"/>
+            <wp:cNvGraphicFramePr>
+              <a:graphicFrameLocks noChangeAspect="1"/>
+            </wp:cNvGraphicFramePr>
+            <a:graphic>
+              <a:graphicData uri="http://schemas.openxmlformats.org/drawingml/2006/picture">
+                <pic:pic>
+                  <pic:nvPicPr>
+                    <pic:cNvPr id="0" name="主用例图.png"/>
+                    <pic:cNvPicPr/>
+                  </pic:nvPicPr>
+                  <pic:blipFill>
+                    <a:blip r:embed="rId9"/>
+                    <a:stretch>
+                      <a:fillRect/>
+                    </a:stretch>
+                  </pic:blipFill>
+                  <pic:spPr>
+                    <a:xfrm>
+                      <a:off x="0" y="0"/>
+                      <a:ext cx="5669280" cy="3501614"/>
+                    </a:xfrm>
+                    <a:prstGeom prst="rect"/>
+                  </pic:spPr>
+                </pic:pic>
+              </a:graphicData>
+            </a:graphic>
+          </wp:inline>
+        </w:drawing>
       </w:r>
     </w:p>
     <w:p>
       <w:pPr>
-        <w:keepNext/>
-        <w:spacing w:before="280" w:after="120"/>
-        <w:pBdr>
-          <w:bottom w:val="single" w:sz="8" w:space="4" w:color="1A7A3D"/>
-        </w:pBdr>
+        <w:spacing w:after="100"/>
       </w:pPr>
       <w:r>
         <w:rPr>
           <w:rFonts w:ascii="Microsoft YaHei" w:hAnsi="Microsoft YaHei" w:eastAsia="Microsoft YaHei"/>
           <w:b/>
-          <w:color w:val="1A7A3D"/>
-          <w:sz w:val="36"/>
         </w:rPr>
-        <w:t>目录结构</w:t>
+        <w:t>UC-MEMBER 会员子用例图：</w:t>
+      </w:r>
+      <w:r>
+        <w:rPr>
+          <w:rFonts w:ascii="Microsoft YaHei" w:hAnsi="Microsoft YaHei" w:eastAsia="Microsoft YaHei"/>
+        </w:rPr>
+        <w:t>展开会员账号、档案、权益、积分、优惠券、评价复购与隐私授权能力。</w:t>
       </w:r>
     </w:p>
-    <w:tbl>
-      <w:tblPr>
-        <w:tblW w:type="auto" w:w="0"/>
-        <w:jc w:val="center"/>
-        <w:tblLook w:firstColumn="1" w:firstRow="1" w:lastColumn="0" w:lastRow="0" w:noHBand="0" w:noVBand="1" w:val="04A0"/>
-      </w:tblPr>
-      <w:tblGrid>
-        <w:gridCol w:w="9746"/>
-      </w:tblGrid>
-      <w:tr>
-        <w:tc>
-          <w:tcPr>
-            <w:tcW w:type="dxa" w:w="9746"/>
-            <w:shd w:val="clear" w:color="auto" w:fill="2B2B2B"/>
-            <w:tcBorders>
-              <w:top w:val="single" w:sz="4" w:space="0" w:color="2B2B2B"/>
-              <w:left w:val="single" w:sz="4" w:space="0" w:color="2B2B2B"/>
-              <w:bottom w:val="single" w:sz="4" w:space="0" w:color="2B2B2B"/>
-              <w:right w:val="single" w:sz="4" w:space="0" w:color="2B2B2B"/>
-            </w:tcBorders>
-          </w:tcPr>
-          <w:p>
-            <w:pPr>
-              <w:spacing w:after="0" w:line="288" w:lineRule="auto"/>
-            </w:pPr>
-            <w:r>
-              <w:rPr>
-                <w:rFonts w:ascii="Consolas" w:hAnsi="Consolas" w:eastAsia="Consolas"/>
-                <w:b w:val="0"/>
-                <w:color w:val="F0F0F0"/>
-                <w:sz w:val="19"/>
-              </w:rPr>
-              <w:t>UML/</w:t>
-            </w:r>
-          </w:p>
-          <w:p>
-            <w:pPr>
-              <w:spacing w:after="0" w:line="288" w:lineRule="auto"/>
-            </w:pPr>
-            <w:r>
-              <w:rPr>
-                <w:rFonts w:ascii="Consolas" w:hAnsi="Consolas" w:eastAsia="Consolas"/>
-                <w:b w:val="0"/>
-                <w:color w:val="F0F0F0"/>
-                <w:sz w:val="19"/>
-              </w:rPr>
-              <w:t>├── usecase/    主用例图.puml + 子用例_预约.puml + 子用例_会员.puml</w:t>
-            </w:r>
-          </w:p>
-          <w:p>
-            <w:pPr>
-              <w:spacing w:after="0" w:line="288" w:lineRule="auto"/>
-            </w:pPr>
-            <w:r>
-              <w:rPr>
-                <w:rFonts w:ascii="Consolas" w:hAnsi="Consolas" w:eastAsia="Consolas"/>
-                <w:b w:val="0"/>
-                <w:color w:val="F0F0F0"/>
-                <w:sz w:val="19"/>
-              </w:rPr>
-              <w:t>├── activity/   桌位预约活动图.puml + 猫咪健康打卡活动图.puml</w:t>
-            </w:r>
-          </w:p>
-          <w:p>
-            <w:pPr>
-              <w:spacing w:after="0" w:line="288" w:lineRule="auto"/>
-            </w:pPr>
-            <w:r>
-              <w:rPr>
-                <w:rFonts w:ascii="Consolas" w:hAnsi="Consolas" w:eastAsia="Consolas"/>
-                <w:b w:val="0"/>
-                <w:color w:val="F0F0F0"/>
-                <w:sz w:val="19"/>
-              </w:rPr>
-              <w:t>├── class/      领域类图.puml</w:t>
-            </w:r>
-          </w:p>
-          <w:p>
-            <w:pPr>
-              <w:spacing w:after="0" w:line="288" w:lineRule="auto"/>
-            </w:pPr>
-            <w:r>
-              <w:rPr>
-                <w:rFonts w:ascii="Consolas" w:hAnsi="Consolas" w:eastAsia="Consolas"/>
-                <w:b w:val="0"/>
-                <w:color w:val="F0F0F0"/>
-                <w:sz w:val="19"/>
-              </w:rPr>
-              <w:t>├── sequence/   下单顺序图.puml + 跨服务调用顺序图.puml</w:t>
-            </w:r>
-          </w:p>
-          <w:p>
-            <w:pPr>
-              <w:spacing w:after="0" w:line="288" w:lineRule="auto"/>
-            </w:pPr>
-            <w:r>
-              <w:rPr>
-                <w:rFonts w:ascii="Consolas" w:hAnsi="Consolas" w:eastAsia="Consolas"/>
-                <w:b w:val="0"/>
-                <w:color w:val="F0F0F0"/>
-                <w:sz w:val="19"/>
-              </w:rPr>
-              <w:t>├── state/      订单状态机.puml</w:t>
-            </w:r>
-          </w:p>
-          <w:p>
-            <w:pPr>
-              <w:spacing w:after="0" w:line="288" w:lineRule="auto"/>
-            </w:pPr>
-            <w:r>
-              <w:rPr>
-                <w:rFonts w:ascii="Consolas" w:hAnsi="Consolas" w:eastAsia="Consolas"/>
-                <w:b w:val="0"/>
-                <w:color w:val="F0F0F0"/>
-                <w:sz w:val="19"/>
-              </w:rPr>
-              <w:t>└── exports/    PNG + SVG 自动导出</w:t>
-            </w:r>
-          </w:p>
-          <w:p>
-            <w:pPr>
-              <w:spacing w:before="0" w:after="0"/>
-            </w:pPr>
-          </w:p>
-          <w:p>
-            <w:pPr>
-              <w:jc w:val="center"/>
-            </w:pPr>
-            <w:r>
-              <w:drawing>
-                <wp:inline xmlns:a="http://schemas.openxmlformats.org/drawingml/2006/main" xmlns:pic="http://schemas.openxmlformats.org/drawingml/2006/picture">
-                  <wp:extent cx="4983480" cy="2958941"/>
-                  <wp:docPr id="1" name="Picture 1"/>
-                  <wp:cNvGraphicFramePr>
-                    <a:graphicFrameLocks noChangeAspect="1"/>
-                  </wp:cNvGraphicFramePr>
-                  <a:graphic>
-                    <a:graphicData uri="http://schemas.openxmlformats.org/drawingml/2006/picture">
-                      <pic:pic>
-                        <pic:nvPicPr>
-                          <pic:cNvPr id="0" name="image.png"/>
-                          <pic:cNvPicPr/>
-                        </pic:nvPicPr>
-                        <pic:blipFill>
-                          <a:blip r:embed="rId9"/>
-                          <a:stretch>
-                            <a:fillRect/>
-                          </a:stretch>
-                        </pic:blipFill>
-                        <pic:spPr>
-                          <a:xfrm>
-                            <a:off x="0" y="0"/>
-                            <a:ext cx="4983480" cy="2958941"/>
-                          </a:xfrm>
-                          <a:prstGeom prst="rect"/>
-                        </pic:spPr>
-                      </pic:pic>
-                    </a:graphicData>
-                  </a:graphic>
-                </wp:inline>
-              </w:drawing>
-            </w:r>
-          </w:p>
-          <w:p>
-            <w:pPr>
-              <w:jc w:val="center"/>
-            </w:pPr>
-            <w:r>
-              <w:t>图1-3 UML 图集核心用例总览</w:t>
-            </w:r>
-          </w:p>
-          <w:p>
-            <w:pPr>
-              <w:spacing w:before="0" w:after="0"/>
-            </w:pPr>
-          </w:p>
-          <w:p>
-            <w:pPr>
-              <w:jc w:val="center"/>
-            </w:pPr>
-            <w:r>
-              <w:drawing>
-                <wp:inline xmlns:a="http://schemas.openxmlformats.org/drawingml/2006/main" xmlns:pic="http://schemas.openxmlformats.org/drawingml/2006/picture">
-                  <wp:extent cx="4983480" cy="2958941"/>
-                  <wp:docPr id="2" name="Picture 2"/>
-                  <wp:cNvGraphicFramePr>
-                    <a:graphicFrameLocks noChangeAspect="1"/>
-                  </wp:cNvGraphicFramePr>
-                  <a:graphic>
-                    <a:graphicData uri="http://schemas.openxmlformats.org/drawingml/2006/picture">
-                      <pic:pic>
-                        <pic:nvPicPr>
-                          <pic:cNvPr id="0" name="image.png"/>
-                          <pic:cNvPicPr/>
-                        </pic:nvPicPr>
-                        <pic:blipFill>
-                          <a:blip r:embed="rId10"/>
-                          <a:stretch>
-                            <a:fillRect/>
-                          </a:stretch>
-                        </pic:blipFill>
-                        <pic:spPr>
-                          <a:xfrm>
-                            <a:off x="0" y="0"/>
-                            <a:ext cx="4983480" cy="2958941"/>
-                          </a:xfrm>
-                          <a:prstGeom prst="rect"/>
-                        </pic:spPr>
-                      </pic:pic>
-                    </a:graphicData>
-                  </a:graphic>
-                </wp:inline>
-              </w:drawing>
-            </w:r>
-          </w:p>
-          <w:p>
-            <w:pPr>
-              <w:jc w:val="center"/>
-            </w:pPr>
-            <w:r>
-              <w:t>图1-4 UML 与 RTM 追溯关系</w:t>
-            </w:r>
-          </w:p>
-        </w:tc>
-      </w:tr>
-    </w:tbl>
-    <w:p/>
     <w:p>
       <w:pPr>
-        <w:keepNext/>
-        <w:spacing w:before="280" w:after="120"/>
-        <w:pBdr>
-          <w:bottom w:val="single" w:sz="8" w:space="4" w:color="1A7A3D"/>
-        </w:pBdr>
+        <w:jc w:val="center"/>
+      </w:pPr>
+      <w:r>
+        <w:drawing>
+          <wp:inline xmlns:a="http://schemas.openxmlformats.org/drawingml/2006/main" xmlns:pic="http://schemas.openxmlformats.org/drawingml/2006/picture">
+            <wp:extent cx="5669280" cy="3401568"/>
+            <wp:docPr id="2" name="Picture 2"/>
+            <wp:cNvGraphicFramePr>
+              <a:graphicFrameLocks noChangeAspect="1"/>
+            </wp:cNvGraphicFramePr>
+            <a:graphic>
+              <a:graphicData uri="http://schemas.openxmlformats.org/drawingml/2006/picture">
+                <pic:pic>
+                  <pic:nvPicPr>
+                    <pic:cNvPr id="0" name="子用例_会员.png"/>
+                    <pic:cNvPicPr/>
+                  </pic:nvPicPr>
+                  <pic:blipFill>
+                    <a:blip r:embed="rId10"/>
+                    <a:stretch>
+                      <a:fillRect/>
+                    </a:stretch>
+                  </pic:blipFill>
+                  <pic:spPr>
+                    <a:xfrm>
+                      <a:off x="0" y="0"/>
+                      <a:ext cx="5669280" cy="3401568"/>
+                    </a:xfrm>
+                    <a:prstGeom prst="rect"/>
+                  </pic:spPr>
+                </pic:pic>
+              </a:graphicData>
+            </a:graphic>
+          </wp:inline>
+        </w:drawing>
+      </w:r>
+    </w:p>
+    <w:p>
+      <w:pPr>
+        <w:spacing w:after="100"/>
       </w:pPr>
       <w:r>
         <w:rPr>
           <w:rFonts w:ascii="Microsoft YaHei" w:hAnsi="Microsoft YaHei" w:eastAsia="Microsoft YaHei"/>
           <w:b/>
-          <w:color w:val="1A7A3D"/>
-          <w:sz w:val="36"/>
         </w:rPr>
-        <w:t>每张图的说明文件</w:t>
+        <w:t>UC-RESERVE 预约子用例图：</w:t>
+      </w:r>
+      <w:r>
+        <w:rPr>
+          <w:rFonts w:ascii="Microsoft YaHei" w:hAnsi="Microsoft YaHei" w:eastAsia="Microsoft YaHei"/>
+        </w:rPr>
+        <w:t>展开门店时段查询、猫咪出勤、桌位锁定、订金支付、改签取消、候补和到店核销。</w:t>
       </w:r>
     </w:p>
     <w:p>
       <w:pPr>
-        <w:spacing w:after="80" w:before="0" w:line="336" w:lineRule="auto"/>
-        <w:ind w:firstLine="340"/>
-        <w:jc w:val="left"/>
+        <w:jc w:val="center"/>
       </w:pPr>
       <w:r>
-        <w:rPr>
-          <w:rFonts w:ascii="Microsoft YaHei" w:hAnsi="Microsoft YaHei" w:eastAsia="Microsoft YaHei"/>
-          <w:b w:val="0"/>
-          <w:color w:val="2B2B2B"/>
-          <w:sz w:val="21"/>
-        </w:rPr>
-        <w:t>每张图须配一份同名 .docx 说明文件，包含：图编号与图题、元素清单、关键设计取舍与替代方案。本目录已为你预占说明文件骨架。</w:t>
+        <w:drawing>
+          <wp:inline xmlns:a="http://schemas.openxmlformats.org/drawingml/2006/main" xmlns:pic="http://schemas.openxmlformats.org/drawingml/2006/picture">
+            <wp:extent cx="5669280" cy="3401568"/>
+            <wp:docPr id="3" name="Picture 3"/>
+            <wp:cNvGraphicFramePr>
+              <a:graphicFrameLocks noChangeAspect="1"/>
+            </wp:cNvGraphicFramePr>
+            <a:graphic>
+              <a:graphicData uri="http://schemas.openxmlformats.org/drawingml/2006/picture">
+                <pic:pic>
+                  <pic:nvPicPr>
+                    <pic:cNvPr id="0" name="子用例_预约.png"/>
+                    <pic:cNvPicPr/>
+                  </pic:nvPicPr>
+                  <pic:blipFill>
+                    <a:blip r:embed="rId11"/>
+                    <a:stretch>
+                      <a:fillRect/>
+                    </a:stretch>
+                  </pic:blipFill>
+                  <pic:spPr>
+                    <a:xfrm>
+                      <a:off x="0" y="0"/>
+                      <a:ext cx="5669280" cy="3401568"/>
+                    </a:xfrm>
+                    <a:prstGeom prst="rect"/>
+                  </pic:spPr>
+                </pic:pic>
+              </a:graphicData>
+            </a:graphic>
+          </wp:inline>
+        </w:drawing>
       </w:r>
     </w:p>
-    <w:tbl>
-      <w:tblPr>
-        <w:tblW w:type="auto" w:w="0"/>
-        <w:jc w:val="center"/>
-        <w:tblLook w:firstColumn="1" w:firstRow="1" w:lastColumn="0" w:lastRow="0" w:noHBand="0" w:noVBand="1" w:val="04A0"/>
-      </w:tblPr>
-      <w:tblGrid>
-        <w:gridCol w:w="9746"/>
-      </w:tblGrid>
-      <w:tr>
-        <w:tc>
-          <w:tcPr>
-            <w:tcW w:type="dxa" w:w="9746"/>
-            <w:shd w:val="clear" w:color="auto" w:fill="FDF4E3"/>
-            <w:tcBorders>
-              <w:top w:val="single" w:sz="8" w:space="0" w:color="E8A52B"/>
-              <w:left w:val="single" w:sz="8" w:space="0" w:color="E8A52B"/>
-              <w:bottom w:val="single" w:sz="8" w:space="0" w:color="E8A52B"/>
-              <w:right w:val="single" w:sz="8" w:space="0" w:color="E8A52B"/>
-            </w:tcBorders>
-          </w:tcPr>
-          <w:p>
-            <w:pPr>
-              <w:spacing w:after="40"/>
-            </w:pPr>
-            <w:r>
-              <w:rPr>
-                <w:rFonts w:ascii="Microsoft YaHei" w:hAnsi="Microsoft YaHei" w:eastAsia="Microsoft YaHei"/>
-                <w:b/>
-                <w:color w:val="C98B21"/>
-                <w:sz w:val="21"/>
-              </w:rPr>
-              <w:t xml:space="preserve">📌 注意 </w:t>
-            </w:r>
-          </w:p>
-          <w:p>
-            <w:pPr>
-              <w:spacing w:after="40" w:line="336" w:lineRule="auto"/>
-            </w:pPr>
-            <w:r>
-              <w:rPr>
-                <w:rFonts w:ascii="Microsoft YaHei" w:hAnsi="Microsoft YaHei" w:eastAsia="Microsoft YaHei"/>
-                <w:b w:val="0"/>
-                <w:color w:val="2B2B2B"/>
-                <w:sz w:val="20"/>
-              </w:rPr>
-              <w:t>所有 .puml 文件须可通过 plantuml *.puml -tpng 一键导出 PNG，导出失败的图视为不合格。</w:t>
-            </w:r>
-          </w:p>
-        </w:tc>
-      </w:tr>
-    </w:tbl>
-    <w:p/>
     <w:sectPr>
       <w:pgSz w:w="12240" w:h="15840"/>
-      <w:pgMar w:top="1134" w:right="1247" w:bottom="1134" w:left="1247" w:header="720" w:footer="720" w:gutter="0"/>
+      <w:pgMar w:top="964" w:right="964" w:bottom="964" w:left="964" w:header="720" w:footer="720" w:gutter="0"/>
       <w:cols w:space="720"/>
       <w:docGrid w:linePitch="360"/>
     </w:sectPr>

</xml_diff>